<commit_message>
Title page: original study description
</commit_message>
<xml_diff>
--- a/manuscript/Title_Page.docx
+++ b/manuscript/Title_Page.docx
@@ -213,7 +213,7 @@
         <w:t xml:space="preserve"> </w:t>
       </w:r>
       <w:r>
-        <w:t xml:space="preserve">The threshold estimates replicated in this paper come from an unpublished working paper by M. Xu and X. Niu,</w:t>
+        <w:t xml:space="preserve">The threshold estimates replicated in this paper come from an earlier working paper involving the second author,</w:t>
       </w:r>
       <w:r>
         <w:t xml:space="preserve"> </w:t>
@@ -225,7 +225,7 @@
         <w:t xml:space="preserve"> </w:t>
       </w:r>
       <w:r>
-        <w:t xml:space="preserve">(drafts dated November 2023 to July 2025).</w:t>
+        <w:t xml:space="preserve">(drafts dated November 2023 to July 2025), which was neither submitted nor published.</w:t>
       </w:r>
     </w:p>
     <w:p>

</xml_diff>